<commit_message>
Added the coding problems in one folder
</commit_message>
<xml_diff>
--- a/java/Java Question.docx
+++ b/java/Java Question.docx
@@ -61,7 +61,7 @@
           <w:r>
             <w:fldChar w:fldCharType="separate"/>
           </w:r>
-          <w:hyperlink w:anchor="_Toc207392402" w:history="1">
+          <w:hyperlink w:anchor="_Toc211158569" w:history="1">
             <w:r>
               <w:rPr>
                 <w:rStyle w:val="Hyperlink"/>
@@ -88,7 +88,7 @@
                 <w:noProof/>
                 <w:webHidden/>
               </w:rPr>
-              <w:instrText xml:space="preserve"> PAGEREF _Toc207392402 \h </w:instrText>
+              <w:instrText xml:space="preserve"> PAGEREF _Toc211158569 \h </w:instrText>
             </w:r>
             <w:r>
               <w:rPr>
@@ -135,7 +135,7 @@
               <w14:ligatures w14:val="standardContextual"/>
             </w:rPr>
           </w:pPr>
-          <w:hyperlink w:anchor="_Toc207392403" w:history="1">
+          <w:hyperlink w:anchor="_Toc211158570" w:history="1">
             <w:r>
               <w:rPr>
                 <w:rStyle w:val="Hyperlink"/>
@@ -180,7 +180,7 @@
                 <w:noProof/>
                 <w:webHidden/>
               </w:rPr>
-              <w:instrText xml:space="preserve"> PAGEREF _Toc207392403 \h </w:instrText>
+              <w:instrText xml:space="preserve"> PAGEREF _Toc211158570 \h </w:instrText>
             </w:r>
             <w:r>
               <w:rPr>
@@ -227,7 +227,7 @@
               <w14:ligatures w14:val="standardContextual"/>
             </w:rPr>
           </w:pPr>
-          <w:hyperlink w:anchor="_Toc207392404" w:history="1">
+          <w:hyperlink w:anchor="_Toc211158571" w:history="1">
             <w:r>
               <w:rPr>
                 <w:rStyle w:val="Hyperlink"/>
@@ -272,7 +272,7 @@
                 <w:noProof/>
                 <w:webHidden/>
               </w:rPr>
-              <w:instrText xml:space="preserve"> PAGEREF _Toc207392404 \h </w:instrText>
+              <w:instrText xml:space="preserve"> PAGEREF _Toc211158571 \h </w:instrText>
             </w:r>
             <w:r>
               <w:rPr>
@@ -319,7 +319,7 @@
               <w14:ligatures w14:val="standardContextual"/>
             </w:rPr>
           </w:pPr>
-          <w:hyperlink w:anchor="_Toc207392405" w:history="1">
+          <w:hyperlink w:anchor="_Toc211158572" w:history="1">
             <w:r>
               <w:rPr>
                 <w:rStyle w:val="Hyperlink"/>
@@ -364,7 +364,7 @@
                 <w:noProof/>
                 <w:webHidden/>
               </w:rPr>
-              <w:instrText xml:space="preserve"> PAGEREF _Toc207392405 \h </w:instrText>
+              <w:instrText xml:space="preserve"> PAGEREF _Toc211158572 \h </w:instrText>
             </w:r>
             <w:r>
               <w:rPr>
@@ -411,7 +411,7 @@
               <w14:ligatures w14:val="standardContextual"/>
             </w:rPr>
           </w:pPr>
-          <w:hyperlink w:anchor="_Toc207392406" w:history="1">
+          <w:hyperlink w:anchor="_Toc211158573" w:history="1">
             <w:r>
               <w:rPr>
                 <w:rStyle w:val="Hyperlink"/>
@@ -456,7 +456,7 @@
                 <w:noProof/>
                 <w:webHidden/>
               </w:rPr>
-              <w:instrText xml:space="preserve"> PAGEREF _Toc207392406 \h </w:instrText>
+              <w:instrText xml:space="preserve"> PAGEREF _Toc211158573 \h </w:instrText>
             </w:r>
             <w:r>
               <w:rPr>
@@ -503,7 +503,7 @@
               <w14:ligatures w14:val="standardContextual"/>
             </w:rPr>
           </w:pPr>
-          <w:hyperlink w:anchor="_Toc207392407" w:history="1">
+          <w:hyperlink w:anchor="_Toc211158574" w:history="1">
             <w:r>
               <w:rPr>
                 <w:rStyle w:val="Hyperlink"/>
@@ -548,7 +548,7 @@
                 <w:noProof/>
                 <w:webHidden/>
               </w:rPr>
-              <w:instrText xml:space="preserve"> PAGEREF _Toc207392407 \h </w:instrText>
+              <w:instrText xml:space="preserve"> PAGEREF _Toc211158574 \h </w:instrText>
             </w:r>
             <w:r>
               <w:rPr>
@@ -595,7 +595,7 @@
               <w14:ligatures w14:val="standardContextual"/>
             </w:rPr>
           </w:pPr>
-          <w:hyperlink w:anchor="_Toc207392408" w:history="1">
+          <w:hyperlink w:anchor="_Toc211158575" w:history="1">
             <w:r>
               <w:rPr>
                 <w:rStyle w:val="Hyperlink"/>
@@ -640,7 +640,7 @@
                 <w:noProof/>
                 <w:webHidden/>
               </w:rPr>
-              <w:instrText xml:space="preserve"> PAGEREF _Toc207392408 \h </w:instrText>
+              <w:instrText xml:space="preserve"> PAGEREF _Toc211158575 \h </w:instrText>
             </w:r>
             <w:r>
               <w:rPr>
@@ -687,7 +687,7 @@
               <w14:ligatures w14:val="standardContextual"/>
             </w:rPr>
           </w:pPr>
-          <w:hyperlink w:anchor="_Toc207392409" w:history="1">
+          <w:hyperlink w:anchor="_Toc211158576" w:history="1">
             <w:r>
               <w:rPr>
                 <w:rStyle w:val="Hyperlink"/>
@@ -732,7 +732,7 @@
                 <w:noProof/>
                 <w:webHidden/>
               </w:rPr>
-              <w:instrText xml:space="preserve"> PAGEREF _Toc207392409 \h </w:instrText>
+              <w:instrText xml:space="preserve"> PAGEREF _Toc211158576 \h </w:instrText>
             </w:r>
             <w:r>
               <w:rPr>
@@ -779,7 +779,7 @@
               <w14:ligatures w14:val="standardContextual"/>
             </w:rPr>
           </w:pPr>
-          <w:hyperlink w:anchor="_Toc207392410" w:history="1">
+          <w:hyperlink w:anchor="_Toc211158577" w:history="1">
             <w:r>
               <w:rPr>
                 <w:rStyle w:val="Hyperlink"/>
@@ -824,7 +824,7 @@
                 <w:noProof/>
                 <w:webHidden/>
               </w:rPr>
-              <w:instrText xml:space="preserve"> PAGEREF _Toc207392410 \h </w:instrText>
+              <w:instrText xml:space="preserve"> PAGEREF _Toc211158577 \h </w:instrText>
             </w:r>
             <w:r>
               <w:rPr>
@@ -871,7 +871,7 @@
               <w14:ligatures w14:val="standardContextual"/>
             </w:rPr>
           </w:pPr>
-          <w:hyperlink w:anchor="_Toc207392411" w:history="1">
+          <w:hyperlink w:anchor="_Toc211158578" w:history="1">
             <w:r>
               <w:rPr>
                 <w:rStyle w:val="Hyperlink"/>
@@ -916,7 +916,7 @@
                 <w:noProof/>
                 <w:webHidden/>
               </w:rPr>
-              <w:instrText xml:space="preserve"> PAGEREF _Toc207392411 \h </w:instrText>
+              <w:instrText xml:space="preserve"> PAGEREF _Toc211158578 \h </w:instrText>
             </w:r>
             <w:r>
               <w:rPr>
@@ -963,7 +963,7 @@
               <w14:ligatures w14:val="standardContextual"/>
             </w:rPr>
           </w:pPr>
-          <w:hyperlink w:anchor="_Toc207392412" w:history="1">
+          <w:hyperlink w:anchor="_Toc211158579" w:history="1">
             <w:r>
               <w:rPr>
                 <w:rStyle w:val="Hyperlink"/>
@@ -1008,7 +1008,7 @@
                 <w:noProof/>
                 <w:webHidden/>
               </w:rPr>
-              <w:instrText xml:space="preserve"> PAGEREF _Toc207392412 \h </w:instrText>
+              <w:instrText xml:space="preserve"> PAGEREF _Toc211158579 \h </w:instrText>
             </w:r>
             <w:r>
               <w:rPr>
@@ -1055,7 +1055,7 @@
               <w14:ligatures w14:val="standardContextual"/>
             </w:rPr>
           </w:pPr>
-          <w:hyperlink w:anchor="_Toc207392413" w:history="1">
+          <w:hyperlink w:anchor="_Toc211158580" w:history="1">
             <w:r>
               <w:rPr>
                 <w:rStyle w:val="Hyperlink"/>
@@ -1100,7 +1100,7 @@
                 <w:noProof/>
                 <w:webHidden/>
               </w:rPr>
-              <w:instrText xml:space="preserve"> PAGEREF _Toc207392413 \h </w:instrText>
+              <w:instrText xml:space="preserve"> PAGEREF _Toc211158580 \h </w:instrText>
             </w:r>
             <w:r>
               <w:rPr>
@@ -1147,7 +1147,7 @@
               <w14:ligatures w14:val="standardContextual"/>
             </w:rPr>
           </w:pPr>
-          <w:hyperlink w:anchor="_Toc207392414" w:history="1">
+          <w:hyperlink w:anchor="_Toc211158581" w:history="1">
             <w:r>
               <w:rPr>
                 <w:rStyle w:val="Hyperlink"/>
@@ -1192,7 +1192,7 @@
                 <w:noProof/>
                 <w:webHidden/>
               </w:rPr>
-              <w:instrText xml:space="preserve"> PAGEREF _Toc207392414 \h </w:instrText>
+              <w:instrText xml:space="preserve"> PAGEREF _Toc211158581 \h </w:instrText>
             </w:r>
             <w:r>
               <w:rPr>
@@ -1239,7 +1239,7 @@
               <w14:ligatures w14:val="standardContextual"/>
             </w:rPr>
           </w:pPr>
-          <w:hyperlink w:anchor="_Toc207392415" w:history="1">
+          <w:hyperlink w:anchor="_Toc211158582" w:history="1">
             <w:r>
               <w:rPr>
                 <w:rStyle w:val="Hyperlink"/>
@@ -1284,7 +1284,7 @@
                 <w:noProof/>
                 <w:webHidden/>
               </w:rPr>
-              <w:instrText xml:space="preserve"> PAGEREF _Toc207392415 \h </w:instrText>
+              <w:instrText xml:space="preserve"> PAGEREF _Toc211158582 \h </w:instrText>
             </w:r>
             <w:r>
               <w:rPr>
@@ -1331,7 +1331,7 @@
               <w14:ligatures w14:val="standardContextual"/>
             </w:rPr>
           </w:pPr>
-          <w:hyperlink w:anchor="_Toc207392416" w:history="1">
+          <w:hyperlink w:anchor="_Toc211158583" w:history="1">
             <w:r>
               <w:rPr>
                 <w:rStyle w:val="Hyperlink"/>
@@ -1376,7 +1376,7 @@
                 <w:noProof/>
                 <w:webHidden/>
               </w:rPr>
-              <w:instrText xml:space="preserve"> PAGEREF _Toc207392416 \h </w:instrText>
+              <w:instrText xml:space="preserve"> PAGEREF _Toc211158583 \h </w:instrText>
             </w:r>
             <w:r>
               <w:rPr>
@@ -1423,7 +1423,7 @@
               <w14:ligatures w14:val="standardContextual"/>
             </w:rPr>
           </w:pPr>
-          <w:hyperlink w:anchor="_Toc207392417" w:history="1">
+          <w:hyperlink w:anchor="_Toc211158584" w:history="1">
             <w:r>
               <w:rPr>
                 <w:rStyle w:val="Hyperlink"/>
@@ -1468,7 +1468,7 @@
                 <w:noProof/>
                 <w:webHidden/>
               </w:rPr>
-              <w:instrText xml:space="preserve"> PAGEREF _Toc207392417 \h </w:instrText>
+              <w:instrText xml:space="preserve"> PAGEREF _Toc211158584 \h </w:instrText>
             </w:r>
             <w:r>
               <w:rPr>
@@ -1515,7 +1515,7 @@
               <w14:ligatures w14:val="standardContextual"/>
             </w:rPr>
           </w:pPr>
-          <w:hyperlink w:anchor="_Toc207392418" w:history="1">
+          <w:hyperlink w:anchor="_Toc211158585" w:history="1">
             <w:r>
               <w:rPr>
                 <w:rStyle w:val="Hyperlink"/>
@@ -1560,7 +1560,7 @@
                 <w:noProof/>
                 <w:webHidden/>
               </w:rPr>
-              <w:instrText xml:space="preserve"> PAGEREF _Toc207392418 \h </w:instrText>
+              <w:instrText xml:space="preserve"> PAGEREF _Toc211158585 \h </w:instrText>
             </w:r>
             <w:r>
               <w:rPr>
@@ -1607,7 +1607,7 @@
               <w14:ligatures w14:val="standardContextual"/>
             </w:rPr>
           </w:pPr>
-          <w:hyperlink w:anchor="_Toc207392419" w:history="1">
+          <w:hyperlink w:anchor="_Toc211158586" w:history="1">
             <w:r>
               <w:rPr>
                 <w:rStyle w:val="Hyperlink"/>
@@ -1652,7 +1652,7 @@
                 <w:noProof/>
                 <w:webHidden/>
               </w:rPr>
-              <w:instrText xml:space="preserve"> PAGEREF _Toc207392419 \h </w:instrText>
+              <w:instrText xml:space="preserve"> PAGEREF _Toc211158586 \h </w:instrText>
             </w:r>
             <w:r>
               <w:rPr>
@@ -1699,7 +1699,7 @@
               <w14:ligatures w14:val="standardContextual"/>
             </w:rPr>
           </w:pPr>
-          <w:hyperlink w:anchor="_Toc207392420" w:history="1">
+          <w:hyperlink w:anchor="_Toc211158587" w:history="1">
             <w:r>
               <w:rPr>
                 <w:rStyle w:val="Hyperlink"/>
@@ -1744,7 +1744,7 @@
                 <w:noProof/>
                 <w:webHidden/>
               </w:rPr>
-              <w:instrText xml:space="preserve"> PAGEREF _Toc207392420 \h </w:instrText>
+              <w:instrText xml:space="preserve"> PAGEREF _Toc211158587 \h </w:instrText>
             </w:r>
             <w:r>
               <w:rPr>
@@ -1791,7 +1791,7 @@
               <w14:ligatures w14:val="standardContextual"/>
             </w:rPr>
           </w:pPr>
-          <w:hyperlink w:anchor="_Toc207392421" w:history="1">
+          <w:hyperlink w:anchor="_Toc211158588" w:history="1">
             <w:r>
               <w:rPr>
                 <w:rStyle w:val="Hyperlink"/>
@@ -1836,7 +1836,7 @@
                 <w:noProof/>
                 <w:webHidden/>
               </w:rPr>
-              <w:instrText xml:space="preserve"> PAGEREF _Toc207392421 \h </w:instrText>
+              <w:instrText xml:space="preserve"> PAGEREF _Toc211158588 \h </w:instrText>
             </w:r>
             <w:r>
               <w:rPr>
@@ -1883,7 +1883,7 @@
               <w14:ligatures w14:val="standardContextual"/>
             </w:rPr>
           </w:pPr>
-          <w:hyperlink w:anchor="_Toc207392422" w:history="1">
+          <w:hyperlink w:anchor="_Toc211158589" w:history="1">
             <w:r>
               <w:rPr>
                 <w:rStyle w:val="Hyperlink"/>
@@ -1928,7 +1928,7 @@
                 <w:noProof/>
                 <w:webHidden/>
               </w:rPr>
-              <w:instrText xml:space="preserve"> PAGEREF _Toc207392422 \h </w:instrText>
+              <w:instrText xml:space="preserve"> PAGEREF _Toc211158589 \h </w:instrText>
             </w:r>
             <w:r>
               <w:rPr>
@@ -1975,7 +1975,7 @@
               <w14:ligatures w14:val="standardContextual"/>
             </w:rPr>
           </w:pPr>
-          <w:hyperlink w:anchor="_Toc207392423" w:history="1">
+          <w:hyperlink w:anchor="_Toc211158590" w:history="1">
             <w:r>
               <w:rPr>
                 <w:rStyle w:val="Hyperlink"/>
@@ -2020,7 +2020,7 @@
                 <w:noProof/>
                 <w:webHidden/>
               </w:rPr>
-              <w:instrText xml:space="preserve"> PAGEREF _Toc207392423 \h </w:instrText>
+              <w:instrText xml:space="preserve"> PAGEREF _Toc211158590 \h </w:instrText>
             </w:r>
             <w:r>
               <w:rPr>
@@ -2067,7 +2067,7 @@
               <w14:ligatures w14:val="standardContextual"/>
             </w:rPr>
           </w:pPr>
-          <w:hyperlink w:anchor="_Toc207392424" w:history="1">
+          <w:hyperlink w:anchor="_Toc211158591" w:history="1">
             <w:r>
               <w:rPr>
                 <w:rStyle w:val="Hyperlink"/>
@@ -2112,7 +2112,7 @@
                 <w:noProof/>
                 <w:webHidden/>
               </w:rPr>
-              <w:instrText xml:space="preserve"> PAGEREF _Toc207392424 \h </w:instrText>
+              <w:instrText xml:space="preserve"> PAGEREF _Toc211158591 \h </w:instrText>
             </w:r>
             <w:r>
               <w:rPr>
@@ -2159,7 +2159,7 @@
               <w14:ligatures w14:val="standardContextual"/>
             </w:rPr>
           </w:pPr>
-          <w:hyperlink w:anchor="_Toc207392425" w:history="1">
+          <w:hyperlink w:anchor="_Toc211158592" w:history="1">
             <w:r>
               <w:rPr>
                 <w:rStyle w:val="Hyperlink"/>
@@ -2204,7 +2204,7 @@
                 <w:noProof/>
                 <w:webHidden/>
               </w:rPr>
-              <w:instrText xml:space="preserve"> PAGEREF _Toc207392425 \h </w:instrText>
+              <w:instrText xml:space="preserve"> PAGEREF _Toc211158592 \h </w:instrText>
             </w:r>
             <w:r>
               <w:rPr>
@@ -2251,7 +2251,7 @@
               <w14:ligatures w14:val="standardContextual"/>
             </w:rPr>
           </w:pPr>
-          <w:hyperlink w:anchor="_Toc207392426" w:history="1">
+          <w:hyperlink w:anchor="_Toc211158593" w:history="1">
             <w:r>
               <w:rPr>
                 <w:rStyle w:val="Hyperlink"/>
@@ -2296,7 +2296,7 @@
                 <w:noProof/>
                 <w:webHidden/>
               </w:rPr>
-              <w:instrText xml:space="preserve"> PAGEREF _Toc207392426 \h </w:instrText>
+              <w:instrText xml:space="preserve"> PAGEREF _Toc211158593 \h </w:instrText>
             </w:r>
             <w:r>
               <w:rPr>
@@ -2343,7 +2343,7 @@
               <w14:ligatures w14:val="standardContextual"/>
             </w:rPr>
           </w:pPr>
-          <w:hyperlink w:anchor="_Toc207392427" w:history="1">
+          <w:hyperlink w:anchor="_Toc211158594" w:history="1">
             <w:r>
               <w:rPr>
                 <w:rStyle w:val="Hyperlink"/>
@@ -2388,7 +2388,7 @@
                 <w:noProof/>
                 <w:webHidden/>
               </w:rPr>
-              <w:instrText xml:space="preserve"> PAGEREF _Toc207392427 \h </w:instrText>
+              <w:instrText xml:space="preserve"> PAGEREF _Toc211158594 \h </w:instrText>
             </w:r>
             <w:r>
               <w:rPr>
@@ -2435,7 +2435,7 @@
               <w14:ligatures w14:val="standardContextual"/>
             </w:rPr>
           </w:pPr>
-          <w:hyperlink w:anchor="_Toc207392428" w:history="1">
+          <w:hyperlink w:anchor="_Toc211158595" w:history="1">
             <w:r>
               <w:rPr>
                 <w:rStyle w:val="Hyperlink"/>
@@ -2480,7 +2480,7 @@
                 <w:noProof/>
                 <w:webHidden/>
               </w:rPr>
-              <w:instrText xml:space="preserve"> PAGEREF _Toc207392428 \h </w:instrText>
+              <w:instrText xml:space="preserve"> PAGEREF _Toc211158595 \h </w:instrText>
             </w:r>
             <w:r>
               <w:rPr>
@@ -2527,7 +2527,7 @@
               <w14:ligatures w14:val="standardContextual"/>
             </w:rPr>
           </w:pPr>
-          <w:hyperlink w:anchor="_Toc207392429" w:history="1">
+          <w:hyperlink w:anchor="_Toc211158596" w:history="1">
             <w:r>
               <w:rPr>
                 <w:rStyle w:val="Hyperlink"/>
@@ -2572,7 +2572,7 @@
                 <w:noProof/>
                 <w:webHidden/>
               </w:rPr>
-              <w:instrText xml:space="preserve"> PAGEREF _Toc207392429 \h </w:instrText>
+              <w:instrText xml:space="preserve"> PAGEREF _Toc211158596 \h </w:instrText>
             </w:r>
             <w:r>
               <w:rPr>
@@ -2619,7 +2619,7 @@
               <w14:ligatures w14:val="standardContextual"/>
             </w:rPr>
           </w:pPr>
-          <w:hyperlink w:anchor="_Toc207392430" w:history="1">
+          <w:hyperlink w:anchor="_Toc211158597" w:history="1">
             <w:r>
               <w:rPr>
                 <w:rStyle w:val="Hyperlink"/>
@@ -2664,7 +2664,7 @@
                 <w:noProof/>
                 <w:webHidden/>
               </w:rPr>
-              <w:instrText xml:space="preserve"> PAGEREF _Toc207392430 \h </w:instrText>
+              <w:instrText xml:space="preserve"> PAGEREF _Toc211158597 \h </w:instrText>
             </w:r>
             <w:r>
               <w:rPr>
@@ -2711,7 +2711,7 @@
               <w14:ligatures w14:val="standardContextual"/>
             </w:rPr>
           </w:pPr>
-          <w:hyperlink w:anchor="_Toc207392431" w:history="1">
+          <w:hyperlink w:anchor="_Toc211158598" w:history="1">
             <w:r>
               <w:rPr>
                 <w:rStyle w:val="Hyperlink"/>
@@ -2756,7 +2756,7 @@
                 <w:noProof/>
                 <w:webHidden/>
               </w:rPr>
-              <w:instrText xml:space="preserve"> PAGEREF _Toc207392431 \h </w:instrText>
+              <w:instrText xml:space="preserve"> PAGEREF _Toc211158598 \h </w:instrText>
             </w:r>
             <w:r>
               <w:rPr>
@@ -2803,7 +2803,7 @@
               <w14:ligatures w14:val="standardContextual"/>
             </w:rPr>
           </w:pPr>
-          <w:hyperlink w:anchor="_Toc207392432" w:history="1">
+          <w:hyperlink w:anchor="_Toc211158599" w:history="1">
             <w:r>
               <w:rPr>
                 <w:rStyle w:val="Hyperlink"/>
@@ -2848,7 +2848,7 @@
                 <w:noProof/>
                 <w:webHidden/>
               </w:rPr>
-              <w:instrText xml:space="preserve"> PAGEREF _Toc207392432 \h </w:instrText>
+              <w:instrText xml:space="preserve"> PAGEREF _Toc211158599 \h </w:instrText>
             </w:r>
             <w:r>
               <w:rPr>
@@ -2895,7 +2895,7 @@
               <w14:ligatures w14:val="standardContextual"/>
             </w:rPr>
           </w:pPr>
-          <w:hyperlink w:anchor="_Toc207392433" w:history="1">
+          <w:hyperlink w:anchor="_Toc211158600" w:history="1">
             <w:r>
               <w:rPr>
                 <w:rStyle w:val="Hyperlink"/>
@@ -2940,7 +2940,7 @@
                 <w:noProof/>
                 <w:webHidden/>
               </w:rPr>
-              <w:instrText xml:space="preserve"> PAGEREF _Toc207392433 \h </w:instrText>
+              <w:instrText xml:space="preserve"> PAGEREF _Toc211158600 \h </w:instrText>
             </w:r>
             <w:r>
               <w:rPr>
@@ -2987,7 +2987,7 @@
               <w14:ligatures w14:val="standardContextual"/>
             </w:rPr>
           </w:pPr>
-          <w:hyperlink w:anchor="_Toc207392434" w:history="1">
+          <w:hyperlink w:anchor="_Toc211158601" w:history="1">
             <w:r>
               <w:rPr>
                 <w:rStyle w:val="Hyperlink"/>
@@ -3032,7 +3032,7 @@
                 <w:noProof/>
                 <w:webHidden/>
               </w:rPr>
-              <w:instrText xml:space="preserve"> PAGEREF _Toc207392434 \h </w:instrText>
+              <w:instrText xml:space="preserve"> PAGEREF _Toc211158601 \h </w:instrText>
             </w:r>
             <w:r>
               <w:rPr>
@@ -3079,7 +3079,7 @@
               <w14:ligatures w14:val="standardContextual"/>
             </w:rPr>
           </w:pPr>
-          <w:hyperlink w:anchor="_Toc207392435" w:history="1">
+          <w:hyperlink w:anchor="_Toc211158602" w:history="1">
             <w:r>
               <w:rPr>
                 <w:rStyle w:val="Hyperlink"/>
@@ -3124,7 +3124,7 @@
                 <w:noProof/>
                 <w:webHidden/>
               </w:rPr>
-              <w:instrText xml:space="preserve"> PAGEREF _Toc207392435 \h </w:instrText>
+              <w:instrText xml:space="preserve"> PAGEREF _Toc211158602 \h </w:instrText>
             </w:r>
             <w:r>
               <w:rPr>
@@ -3171,7 +3171,7 @@
               <w14:ligatures w14:val="standardContextual"/>
             </w:rPr>
           </w:pPr>
-          <w:hyperlink w:anchor="_Toc207392436" w:history="1">
+          <w:hyperlink w:anchor="_Toc211158603" w:history="1">
             <w:r>
               <w:rPr>
                 <w:rStyle w:val="Hyperlink"/>
@@ -3216,7 +3216,7 @@
                 <w:noProof/>
                 <w:webHidden/>
               </w:rPr>
-              <w:instrText xml:space="preserve"> PAGEREF _Toc207392436 \h </w:instrText>
+              <w:instrText xml:space="preserve"> PAGEREF _Toc211158603 \h </w:instrText>
             </w:r>
             <w:r>
               <w:rPr>
@@ -3263,7 +3263,7 @@
               <w14:ligatures w14:val="standardContextual"/>
             </w:rPr>
           </w:pPr>
-          <w:hyperlink w:anchor="_Toc207392437" w:history="1">
+          <w:hyperlink w:anchor="_Toc211158604" w:history="1">
             <w:r>
               <w:rPr>
                 <w:rStyle w:val="Hyperlink"/>
@@ -3308,7 +3308,7 @@
                 <w:noProof/>
                 <w:webHidden/>
               </w:rPr>
-              <w:instrText xml:space="preserve"> PAGEREF _Toc207392437 \h </w:instrText>
+              <w:instrText xml:space="preserve"> PAGEREF _Toc211158604 \h </w:instrText>
             </w:r>
             <w:r>
               <w:rPr>
@@ -3355,7 +3355,7 @@
               <w14:ligatures w14:val="standardContextual"/>
             </w:rPr>
           </w:pPr>
-          <w:hyperlink w:anchor="_Toc207392438" w:history="1">
+          <w:hyperlink w:anchor="_Toc211158605" w:history="1">
             <w:r>
               <w:rPr>
                 <w:rStyle w:val="Hyperlink"/>
@@ -3400,7 +3400,7 @@
                 <w:noProof/>
                 <w:webHidden/>
               </w:rPr>
-              <w:instrText xml:space="preserve"> PAGEREF _Toc207392438 \h </w:instrText>
+              <w:instrText xml:space="preserve"> PAGEREF _Toc211158605 \h </w:instrText>
             </w:r>
             <w:r>
               <w:rPr>
@@ -3447,7 +3447,7 @@
               <w14:ligatures w14:val="standardContextual"/>
             </w:rPr>
           </w:pPr>
-          <w:hyperlink w:anchor="_Toc207392439" w:history="1">
+          <w:hyperlink w:anchor="_Toc211158606" w:history="1">
             <w:r>
               <w:rPr>
                 <w:rStyle w:val="Hyperlink"/>
@@ -3492,7 +3492,7 @@
                 <w:noProof/>
                 <w:webHidden/>
               </w:rPr>
-              <w:instrText xml:space="preserve"> PAGEREF _Toc207392439 \h </w:instrText>
+              <w:instrText xml:space="preserve"> PAGEREF _Toc211158606 \h </w:instrText>
             </w:r>
             <w:r>
               <w:rPr>
@@ -3539,7 +3539,7 @@
               <w14:ligatures w14:val="standardContextual"/>
             </w:rPr>
           </w:pPr>
-          <w:hyperlink w:anchor="_Toc207392440" w:history="1">
+          <w:hyperlink w:anchor="_Toc211158607" w:history="1">
             <w:r>
               <w:rPr>
                 <w:rStyle w:val="Hyperlink"/>
@@ -3584,7 +3584,7 @@
                 <w:noProof/>
                 <w:webHidden/>
               </w:rPr>
-              <w:instrText xml:space="preserve"> PAGEREF _Toc207392440 \h </w:instrText>
+              <w:instrText xml:space="preserve"> PAGEREF _Toc211158607 \h </w:instrText>
             </w:r>
             <w:r>
               <w:rPr>
@@ -3631,7 +3631,7 @@
               <w14:ligatures w14:val="standardContextual"/>
             </w:rPr>
           </w:pPr>
-          <w:hyperlink w:anchor="_Toc207392441" w:history="1">
+          <w:hyperlink w:anchor="_Toc211158608" w:history="1">
             <w:r>
               <w:rPr>
                 <w:rStyle w:val="Hyperlink"/>
@@ -3676,7 +3676,7 @@
                 <w:noProof/>
                 <w:webHidden/>
               </w:rPr>
-              <w:instrText xml:space="preserve"> PAGEREF _Toc207392441 \h </w:instrText>
+              <w:instrText xml:space="preserve"> PAGEREF _Toc211158608 \h </w:instrText>
             </w:r>
             <w:r>
               <w:rPr>
@@ -3723,7 +3723,7 @@
               <w14:ligatures w14:val="standardContextual"/>
             </w:rPr>
           </w:pPr>
-          <w:hyperlink w:anchor="_Toc207392442" w:history="1">
+          <w:hyperlink w:anchor="_Toc211158609" w:history="1">
             <w:r>
               <w:rPr>
                 <w:rStyle w:val="Hyperlink"/>
@@ -3768,7 +3768,7 @@
                 <w:noProof/>
                 <w:webHidden/>
               </w:rPr>
-              <w:instrText xml:space="preserve"> PAGEREF _Toc207392442 \h </w:instrText>
+              <w:instrText xml:space="preserve"> PAGEREF _Toc211158609 \h </w:instrText>
             </w:r>
             <w:r>
               <w:rPr>
@@ -3815,7 +3815,7 @@
               <w14:ligatures w14:val="standardContextual"/>
             </w:rPr>
           </w:pPr>
-          <w:hyperlink w:anchor="_Toc207392443" w:history="1">
+          <w:hyperlink w:anchor="_Toc211158610" w:history="1">
             <w:r>
               <w:rPr>
                 <w:rStyle w:val="Hyperlink"/>
@@ -3860,7 +3860,7 @@
                 <w:noProof/>
                 <w:webHidden/>
               </w:rPr>
-              <w:instrText xml:space="preserve"> PAGEREF _Toc207392443 \h </w:instrText>
+              <w:instrText xml:space="preserve"> PAGEREF _Toc211158610 \h </w:instrText>
             </w:r>
             <w:r>
               <w:rPr>
@@ -3907,7 +3907,7 @@
               <w14:ligatures w14:val="standardContextual"/>
             </w:rPr>
           </w:pPr>
-          <w:hyperlink w:anchor="_Toc207392444" w:history="1">
+          <w:hyperlink w:anchor="_Toc211158611" w:history="1">
             <w:r>
               <w:rPr>
                 <w:rStyle w:val="Hyperlink"/>
@@ -3952,7 +3952,7 @@
                 <w:noProof/>
                 <w:webHidden/>
               </w:rPr>
-              <w:instrText xml:space="preserve"> PAGEREF _Toc207392444 \h </w:instrText>
+              <w:instrText xml:space="preserve"> PAGEREF _Toc211158611 \h </w:instrText>
             </w:r>
             <w:r>
               <w:rPr>
@@ -3998,7 +3998,7 @@
               <w14:ligatures w14:val="standardContextual"/>
             </w:rPr>
           </w:pPr>
-          <w:hyperlink w:anchor="_Toc207392445" w:history="1">
+          <w:hyperlink w:anchor="_Toc211158612" w:history="1">
             <w:r>
               <w:rPr>
                 <w:rStyle w:val="Hyperlink"/>
@@ -4025,7 +4025,7 @@
                 <w:noProof/>
                 <w:webHidden/>
               </w:rPr>
-              <w:instrText xml:space="preserve"> PAGEREF _Toc207392445 \h </w:instrText>
+              <w:instrText xml:space="preserve"> PAGEREF _Toc211158612 \h </w:instrText>
             </w:r>
             <w:r>
               <w:rPr>
@@ -4072,7 +4072,7 @@
               <w14:ligatures w14:val="standardContextual"/>
             </w:rPr>
           </w:pPr>
-          <w:hyperlink w:anchor="_Toc207392446" w:history="1">
+          <w:hyperlink w:anchor="_Toc211158613" w:history="1">
             <w:r>
               <w:rPr>
                 <w:rStyle w:val="Hyperlink"/>
@@ -4117,7 +4117,7 @@
                 <w:noProof/>
                 <w:webHidden/>
               </w:rPr>
-              <w:instrText xml:space="preserve"> PAGEREF _Toc207392446 \h </w:instrText>
+              <w:instrText xml:space="preserve"> PAGEREF _Toc211158613 \h </w:instrText>
             </w:r>
             <w:r>
               <w:rPr>
@@ -4164,7 +4164,7 @@
               <w14:ligatures w14:val="standardContextual"/>
             </w:rPr>
           </w:pPr>
-          <w:hyperlink w:anchor="_Toc207392447" w:history="1">
+          <w:hyperlink w:anchor="_Toc211158614" w:history="1">
             <w:r>
               <w:rPr>
                 <w:rStyle w:val="Hyperlink"/>
@@ -4209,7 +4209,7 @@
                 <w:noProof/>
                 <w:webHidden/>
               </w:rPr>
-              <w:instrText xml:space="preserve"> PAGEREF _Toc207392447 \h </w:instrText>
+              <w:instrText xml:space="preserve"> PAGEREF _Toc211158614 \h </w:instrText>
             </w:r>
             <w:r>
               <w:rPr>
@@ -4256,7 +4256,7 @@
               <w14:ligatures w14:val="standardContextual"/>
             </w:rPr>
           </w:pPr>
-          <w:hyperlink w:anchor="_Toc207392448" w:history="1">
+          <w:hyperlink w:anchor="_Toc211158615" w:history="1">
             <w:r>
               <w:rPr>
                 <w:rStyle w:val="Hyperlink"/>
@@ -4301,7 +4301,7 @@
                 <w:noProof/>
                 <w:webHidden/>
               </w:rPr>
-              <w:instrText xml:space="preserve"> PAGEREF _Toc207392448 \h </w:instrText>
+              <w:instrText xml:space="preserve"> PAGEREF _Toc211158615 \h </w:instrText>
             </w:r>
             <w:r>
               <w:rPr>
@@ -4348,7 +4348,7 @@
               <w14:ligatures w14:val="standardContextual"/>
             </w:rPr>
           </w:pPr>
-          <w:hyperlink w:anchor="_Toc207392449" w:history="1">
+          <w:hyperlink w:anchor="_Toc211158616" w:history="1">
             <w:r>
               <w:rPr>
                 <w:rStyle w:val="Hyperlink"/>
@@ -4393,7 +4393,7 @@
                 <w:noProof/>
                 <w:webHidden/>
               </w:rPr>
-              <w:instrText xml:space="preserve"> PAGEREF _Toc207392449 \h </w:instrText>
+              <w:instrText xml:space="preserve"> PAGEREF _Toc211158616 \h </w:instrText>
             </w:r>
             <w:r>
               <w:rPr>
@@ -4439,7 +4439,7 @@
               <w14:ligatures w14:val="standardContextual"/>
             </w:rPr>
           </w:pPr>
-          <w:hyperlink w:anchor="_Toc207392450" w:history="1">
+          <w:hyperlink w:anchor="_Toc211158617" w:history="1">
             <w:r>
               <w:rPr>
                 <w:rStyle w:val="Hyperlink"/>
@@ -4466,7 +4466,7 @@
                 <w:noProof/>
                 <w:webHidden/>
               </w:rPr>
-              <w:instrText xml:space="preserve"> PAGEREF _Toc207392450 \h </w:instrText>
+              <w:instrText xml:space="preserve"> PAGEREF _Toc211158617 \h </w:instrText>
             </w:r>
             <w:r>
               <w:rPr>
@@ -4513,7 +4513,7 @@
               <w14:ligatures w14:val="standardContextual"/>
             </w:rPr>
           </w:pPr>
-          <w:hyperlink w:anchor="_Toc207392451" w:history="1">
+          <w:hyperlink w:anchor="_Toc211158618" w:history="1">
             <w:r>
               <w:rPr>
                 <w:rStyle w:val="Hyperlink"/>
@@ -4558,7 +4558,7 @@
                 <w:noProof/>
                 <w:webHidden/>
               </w:rPr>
-              <w:instrText xml:space="preserve"> PAGEREF _Toc207392451 \h </w:instrText>
+              <w:instrText xml:space="preserve"> PAGEREF _Toc211158618 \h </w:instrText>
             </w:r>
             <w:r>
               <w:rPr>
@@ -4605,7 +4605,7 @@
               <w14:ligatures w14:val="standardContextual"/>
             </w:rPr>
           </w:pPr>
-          <w:hyperlink w:anchor="_Toc207392452" w:history="1">
+          <w:hyperlink w:anchor="_Toc211158619" w:history="1">
             <w:r>
               <w:rPr>
                 <w:rStyle w:val="Hyperlink"/>
@@ -4650,7 +4650,7 @@
                 <w:noProof/>
                 <w:webHidden/>
               </w:rPr>
-              <w:instrText xml:space="preserve"> PAGEREF _Toc207392452 \h </w:instrText>
+              <w:instrText xml:space="preserve"> PAGEREF _Toc211158619 \h </w:instrText>
             </w:r>
             <w:r>
               <w:rPr>
@@ -4697,7 +4697,7 @@
               <w14:ligatures w14:val="standardContextual"/>
             </w:rPr>
           </w:pPr>
-          <w:hyperlink w:anchor="_Toc207392453" w:history="1">
+          <w:hyperlink w:anchor="_Toc211158620" w:history="1">
             <w:r>
               <w:rPr>
                 <w:rStyle w:val="Hyperlink"/>
@@ -4742,7 +4742,7 @@
                 <w:noProof/>
                 <w:webHidden/>
               </w:rPr>
-              <w:instrText xml:space="preserve"> PAGEREF _Toc207392453 \h </w:instrText>
+              <w:instrText xml:space="preserve"> PAGEREF _Toc211158620 \h </w:instrText>
             </w:r>
             <w:r>
               <w:rPr>
@@ -4789,7 +4789,7 @@
               <w14:ligatures w14:val="standardContextual"/>
             </w:rPr>
           </w:pPr>
-          <w:hyperlink w:anchor="_Toc207392454" w:history="1">
+          <w:hyperlink w:anchor="_Toc211158621" w:history="1">
             <w:r>
               <w:rPr>
                 <w:rStyle w:val="Hyperlink"/>
@@ -4834,7 +4834,7 @@
                 <w:noProof/>
                 <w:webHidden/>
               </w:rPr>
-              <w:instrText xml:space="preserve"> PAGEREF _Toc207392454 \h </w:instrText>
+              <w:instrText xml:space="preserve"> PAGEREF _Toc211158621 \h </w:instrText>
             </w:r>
             <w:r>
               <w:rPr>
@@ -4881,7 +4881,7 @@
               <w14:ligatures w14:val="standardContextual"/>
             </w:rPr>
           </w:pPr>
-          <w:hyperlink w:anchor="_Toc207392455" w:history="1">
+          <w:hyperlink w:anchor="_Toc211158622" w:history="1">
             <w:r>
               <w:rPr>
                 <w:rStyle w:val="Hyperlink"/>
@@ -4926,7 +4926,7 @@
                 <w:noProof/>
                 <w:webHidden/>
               </w:rPr>
-              <w:instrText xml:space="preserve"> PAGEREF _Toc207392455 \h </w:instrText>
+              <w:instrText xml:space="preserve"> PAGEREF _Toc211158622 \h </w:instrText>
             </w:r>
             <w:r>
               <w:rPr>
@@ -4973,7 +4973,7 @@
               <w14:ligatures w14:val="standardContextual"/>
             </w:rPr>
           </w:pPr>
-          <w:hyperlink w:anchor="_Toc207392456" w:history="1">
+          <w:hyperlink w:anchor="_Toc211158623" w:history="1">
             <w:r>
               <w:rPr>
                 <w:rStyle w:val="Hyperlink"/>
@@ -5018,7 +5018,7 @@
                 <w:noProof/>
                 <w:webHidden/>
               </w:rPr>
-              <w:instrText xml:space="preserve"> PAGEREF _Toc207392456 \h </w:instrText>
+              <w:instrText xml:space="preserve"> PAGEREF _Toc211158623 \h </w:instrText>
             </w:r>
             <w:r>
               <w:rPr>
@@ -5079,7 +5079,7 @@
       <w:pPr>
         <w:pStyle w:val="Heading2"/>
       </w:pPr>
-      <w:bookmarkStart w:id="0" w:name="_Toc207392402"/>
+      <w:bookmarkStart w:id="0" w:name="_Toc211158569"/>
       <w:r>
         <w:t>Core Java Section</w:t>
       </w:r>
@@ -5093,7 +5093,7 @@
           <w:numId w:val="12"/>
         </w:numPr>
       </w:pPr>
-      <w:bookmarkStart w:id="1" w:name="_Toc207392403"/>
+      <w:bookmarkStart w:id="1" w:name="_Toc211158570"/>
       <w:r>
         <w:t>What is features of Java</w:t>
       </w:r>
@@ -5388,7 +5388,7 @@
           <w:numId w:val="12"/>
         </w:numPr>
       </w:pPr>
-      <w:bookmarkStart w:id="2" w:name="_Toc207392404"/>
+      <w:bookmarkStart w:id="2" w:name="_Toc211158571"/>
       <w:r>
         <w:t>Diff between JDK, JRE, and JVM?</w:t>
       </w:r>
@@ -5583,7 +5583,7 @@
           <w:numId w:val="12"/>
         </w:numPr>
       </w:pPr>
-      <w:bookmarkStart w:id="3" w:name="_Toc207392405"/>
+      <w:bookmarkStart w:id="3" w:name="_Toc211158572"/>
       <w:r>
         <w:t>JVM architecture, generations and memory areas</w:t>
       </w:r>
@@ -5672,8 +5672,23 @@
           <w:t>https://www.turing.com/kb/java-virtual-machine#bootstrap-classloader</w:t>
         </w:r>
       </w:hyperlink>
-    </w:p>
-    <w:p/>
+      <w:r>
+        <w:t xml:space="preserve">, </w:t>
+      </w:r>
+      <w:hyperlink r:id="rId10" w:history="1">
+        <w:r>
+          <w:rPr>
+            <w:rStyle w:val="Hyperlink"/>
+          </w:rPr>
+          <w:t>https://youtu.be/dncpVFP1JeQ?si=X4ymRliBm8nIJLus</w:t>
+        </w:r>
+      </w:hyperlink>
+    </w:p>
+    <w:p>
+      <w:pPr>
+        <w:ind w:left="360"/>
+      </w:pPr>
+    </w:p>
     <w:p>
       <w:pPr>
         <w:pStyle w:val="Heading3"/>
@@ -5682,7 +5697,7 @@
           <w:numId w:val="12"/>
         </w:numPr>
       </w:pPr>
-      <w:bookmarkStart w:id="4" w:name="_Toc207392406"/>
+      <w:bookmarkStart w:id="4" w:name="_Toc211158573"/>
       <w:r>
         <w:t>What is a classloader?</w:t>
       </w:r>
@@ -5709,7 +5724,7 @@
           <w:numId w:val="12"/>
         </w:numPr>
       </w:pPr>
-      <w:bookmarkStart w:id="5" w:name="_Toc207392407"/>
+      <w:bookmarkStart w:id="5" w:name="_Toc211158574"/>
       <w:r>
         <w:t>Explain oops concept in java details</w:t>
       </w:r>
@@ -5722,7 +5737,7 @@
       <w:r>
         <w:t xml:space="preserve">Resources: </w:t>
       </w:r>
-      <w:hyperlink r:id="rId10" w:history="1">
+      <w:hyperlink r:id="rId11" w:history="1">
         <w:r>
           <w:rPr>
             <w:rStyle w:val="Hyperlink"/>
@@ -5739,7 +5754,7 @@
           <w:numId w:val="12"/>
         </w:numPr>
       </w:pPr>
-      <w:bookmarkStart w:id="6" w:name="_Toc207392408"/>
+      <w:bookmarkStart w:id="6" w:name="_Toc211158575"/>
       <w:r>
         <w:t>Difference between Heap and Stack memory?</w:t>
       </w:r>
@@ -6177,7 +6192,7 @@
                     </pic:cNvPicPr>
                   </pic:nvPicPr>
                   <pic:blipFill>
-                    <a:blip r:embed="rId11" cstate="print">
+                    <a:blip r:embed="rId12" cstate="print">
                       <a:extLst>
                         <a:ext uri="{28A0092B-C50C-407E-A947-70E740481C1C}">
                           <a14:useLocalDpi xmlns:a14="http://schemas.microsoft.com/office/drawing/2010/main" val="0"/>
@@ -6250,7 +6265,7 @@
           <w:numId w:val="12"/>
         </w:numPr>
       </w:pPr>
-      <w:bookmarkStart w:id="7" w:name="_Toc207392409"/>
+      <w:bookmarkStart w:id="7" w:name="_Toc211158576"/>
       <w:r>
         <w:lastRenderedPageBreak/>
         <w:t>what is covariant</w:t>
@@ -6392,7 +6407,7 @@
           <w:numId w:val="12"/>
         </w:numPr>
       </w:pPr>
-      <w:bookmarkStart w:id="8" w:name="_Toc207392410"/>
+      <w:bookmarkStart w:id="8" w:name="_Toc211158577"/>
       <w:r>
         <w:t xml:space="preserve">What is </w:t>
       </w:r>
@@ -6526,7 +6541,7 @@
           <w:numId w:val="12"/>
         </w:numPr>
       </w:pPr>
-      <w:bookmarkStart w:id="9" w:name="_Toc207392411"/>
+      <w:bookmarkStart w:id="9" w:name="_Toc211158578"/>
       <w:r>
         <w:t>can static method override and why not?</w:t>
       </w:r>
@@ -6799,7 +6814,7 @@
           <w:numId w:val="12"/>
         </w:numPr>
       </w:pPr>
-      <w:bookmarkStart w:id="10" w:name="_Toc207392412"/>
+      <w:bookmarkStart w:id="10" w:name="_Toc211158579"/>
       <w:r>
         <w:t>What is Garbage Collection in java?</w:t>
       </w:r>
@@ -6987,7 +7002,7 @@
           <w:numId w:val="12"/>
         </w:numPr>
       </w:pPr>
-      <w:bookmarkStart w:id="11" w:name="_Toc207392413"/>
+      <w:bookmarkStart w:id="11" w:name="_Toc211158580"/>
       <w:r>
         <w:t>Type of access specifier in java</w:t>
       </w:r>
@@ -7135,7 +7150,7 @@
                     </pic:cNvPicPr>
                   </pic:nvPicPr>
                   <pic:blipFill>
-                    <a:blip r:embed="rId12">
+                    <a:blip r:embed="rId13">
                       <a:extLst>
                         <a:ext uri="{28A0092B-C50C-407E-A947-70E740481C1C}">
                           <a14:useLocalDpi xmlns:a14="http://schemas.microsoft.com/office/drawing/2010/main" val="0"/>
@@ -7175,7 +7190,7 @@
       <w:r>
         <w:t xml:space="preserve">Resources: </w:t>
       </w:r>
-      <w:hyperlink r:id="rId13" w:history="1">
+      <w:hyperlink r:id="rId14" w:history="1">
         <w:r>
           <w:rPr>
             <w:rStyle w:val="Hyperlink"/>
@@ -7193,7 +7208,7 @@
           <w:numId w:val="12"/>
         </w:numPr>
       </w:pPr>
-      <w:bookmarkStart w:id="12" w:name="_Toc207392414"/>
+      <w:bookmarkStart w:id="12" w:name="_Toc211158581"/>
       <w:r>
         <w:t>When to use of static and default method of functional interface use case?</w:t>
       </w:r>
@@ -7356,7 +7371,7 @@
           <w:numId w:val="12"/>
         </w:numPr>
       </w:pPr>
-      <w:bookmarkStart w:id="13" w:name="_Toc207392415"/>
+      <w:bookmarkStart w:id="13" w:name="_Toc211158582"/>
       <w:r>
         <w:t xml:space="preserve">Diff between </w:t>
       </w:r>
@@ -7588,7 +7603,7 @@
           <w:numId w:val="12"/>
         </w:numPr>
       </w:pPr>
-      <w:bookmarkStart w:id="14" w:name="_Toc207392416"/>
+      <w:bookmarkStart w:id="14" w:name="_Toc211158583"/>
       <w:r>
         <w:t xml:space="preserve">In details explanation of </w:t>
       </w:r>
@@ -7620,7 +7635,7 @@
       <w:r>
         <w:t xml:space="preserve">Resources: </w:t>
       </w:r>
-      <w:hyperlink r:id="rId14" w:history="1">
+      <w:hyperlink r:id="rId15" w:history="1">
         <w:r>
           <w:rPr>
             <w:rStyle w:val="Hyperlink"/>
@@ -7642,7 +7657,7 @@
           <w:numId w:val="12"/>
         </w:numPr>
       </w:pPr>
-      <w:bookmarkStart w:id="15" w:name="_Toc207392417"/>
+      <w:bookmarkStart w:id="15" w:name="_Toc211158584"/>
       <w:r>
         <w:t>Difference between ‘==’ operator and Equals method in java?</w:t>
       </w:r>
@@ -7885,7 +7900,7 @@
           <w:numId w:val="12"/>
         </w:numPr>
       </w:pPr>
-      <w:bookmarkStart w:id="16" w:name="_Toc207392418"/>
+      <w:bookmarkStart w:id="16" w:name="_Toc211158585"/>
       <w:r>
         <w:t>What is hashcode</w:t>
       </w:r>
@@ -8091,7 +8106,7 @@
           <w:numId w:val="12"/>
         </w:numPr>
       </w:pPr>
-      <w:bookmarkStart w:id="17" w:name="_Toc207392419"/>
+      <w:bookmarkStart w:id="17" w:name="_Toc211158586"/>
       <w:r>
         <w:t>What is string literal vs string object</w:t>
       </w:r>
@@ -8241,7 +8256,7 @@
           <w:numId w:val="12"/>
         </w:numPr>
       </w:pPr>
-      <w:bookmarkStart w:id="18" w:name="_Toc207392420"/>
+      <w:bookmarkStart w:id="18" w:name="_Toc211158587"/>
       <w:r>
         <w:t>What is String pool?</w:t>
       </w:r>
@@ -8289,7 +8304,7 @@
                     </pic:cNvPicPr>
                   </pic:nvPicPr>
                   <pic:blipFill>
-                    <a:blip r:embed="rId15">
+                    <a:blip r:embed="rId16">
                       <a:extLst>
                         <a:ext uri="{28A0092B-C50C-407E-A947-70E740481C1C}">
                           <a14:useLocalDpi xmlns:a14="http://schemas.microsoft.com/office/drawing/2010/main" val="0"/>
@@ -8329,7 +8344,7 @@
           <w:numId w:val="12"/>
         </w:numPr>
       </w:pPr>
-      <w:bookmarkStart w:id="19" w:name="_Toc207392421"/>
+      <w:bookmarkStart w:id="19" w:name="_Toc211158588"/>
       <w:r>
         <w:t>What Is an Immutable Object?</w:t>
       </w:r>
@@ -8365,7 +8380,7 @@
           <w:numId w:val="12"/>
         </w:numPr>
       </w:pPr>
-      <w:bookmarkStart w:id="20" w:name="_Toc207392422"/>
+      <w:bookmarkStart w:id="20" w:name="_Toc211158589"/>
       <w:r>
         <w:t>Why the string in java immutable?</w:t>
       </w:r>
@@ -8618,7 +8633,7 @@
           <w:numId w:val="12"/>
         </w:numPr>
       </w:pPr>
-      <w:bookmarkStart w:id="21" w:name="_Toc207392423"/>
+      <w:bookmarkStart w:id="21" w:name="_Toc211158590"/>
       <w:r>
         <w:t>Diff between the transient and volatile keyword and when to use</w:t>
       </w:r>
@@ -8948,7 +8963,7 @@
           <w:numId w:val="12"/>
         </w:numPr>
       </w:pPr>
-      <w:bookmarkStart w:id="22" w:name="_Toc207392424"/>
+      <w:bookmarkStart w:id="22" w:name="_Toc211158591"/>
       <w:r>
         <w:t>W</w:t>
       </w:r>
@@ -9202,7 +9217,7 @@
           <w:numId w:val="12"/>
         </w:numPr>
       </w:pPr>
-      <w:bookmarkStart w:id="23" w:name="_Toc207392425"/>
+      <w:bookmarkStart w:id="23" w:name="_Toc211158592"/>
       <w:r>
         <w:t>Typecasting in Java</w:t>
       </w:r>
@@ -9229,7 +9244,7 @@
       <w:r>
         <w:t>Resources:</w:t>
       </w:r>
-      <w:hyperlink r:id="rId16" w:history="1">
+      <w:hyperlink r:id="rId17" w:history="1">
         <w:r>
           <w:rPr>
             <w:rStyle w:val="Hyperlink"/>
@@ -9250,7 +9265,7 @@
           <w:numId w:val="12"/>
         </w:numPr>
       </w:pPr>
-      <w:bookmarkStart w:id="24" w:name="_Toc207392426"/>
+      <w:bookmarkStart w:id="24" w:name="_Toc211158593"/>
       <w:r>
         <w:t>Why variables in interface are public, static and final?</w:t>
       </w:r>
@@ -9334,7 +9349,7 @@
           <w:numId w:val="12"/>
         </w:numPr>
       </w:pPr>
-      <w:bookmarkStart w:id="25" w:name="_Toc207392427"/>
+      <w:bookmarkStart w:id="25" w:name="_Toc211158594"/>
       <w:r>
         <w:t>What is feature of Java 8</w:t>
       </w:r>
@@ -9348,7 +9363,7 @@
           <w:numId w:val="37"/>
         </w:numPr>
       </w:pPr>
-      <w:hyperlink r:id="rId17" w:anchor="functional-interfaces-and-lambda-expressions" w:history="1">
+      <w:hyperlink r:id="rId18" w:anchor="functional-interfaces-and-lambda-expressions" w:history="1">
         <w:r>
           <w:t xml:space="preserve">Functional Interfaces </w:t>
         </w:r>
@@ -9368,7 +9383,7 @@
           <w:numId w:val="37"/>
         </w:numPr>
       </w:pPr>
-      <w:hyperlink r:id="rId18" w:anchor="foreach-method-in-iterable-interface" w:history="1">
+      <w:hyperlink r:id="rId19" w:anchor="foreach-method-in-iterable-interface" w:history="1">
         <w:r>
           <w:t>forEach() Method In Iterable Interface</w:t>
         </w:r>
@@ -9382,7 +9397,7 @@
           <w:numId w:val="37"/>
         </w:numPr>
       </w:pPr>
-      <w:hyperlink r:id="rId19" w:anchor="optional-class" w:history="1">
+      <w:hyperlink r:id="rId20" w:anchor="optional-class" w:history="1">
         <w:r>
           <w:t>Optional Class</w:t>
         </w:r>
@@ -9396,7 +9411,7 @@
           <w:numId w:val="37"/>
         </w:numPr>
       </w:pPr>
-      <w:hyperlink r:id="rId20" w:anchor="default-and-static-methods-in-interfaces" w:history="1">
+      <w:hyperlink r:id="rId21" w:anchor="default-and-static-methods-in-interfaces" w:history="1">
         <w:r>
           <w:t>Default And Static Methods In Interfaces</w:t>
         </w:r>
@@ -9422,7 +9437,7 @@
           <w:numId w:val="37"/>
         </w:numPr>
       </w:pPr>
-      <w:hyperlink r:id="rId21" w:anchor="java-stream-api-for-bulk-data-operations-on-collections" w:history="1">
+      <w:hyperlink r:id="rId22" w:anchor="java-stream-api-for-bulk-data-operations-on-collections" w:history="1">
         <w:r>
           <w:t>Java Stream API For Bulk Data Operations On Collections</w:t>
         </w:r>
@@ -9436,7 +9451,7 @@
           <w:numId w:val="37"/>
         </w:numPr>
       </w:pPr>
-      <w:hyperlink r:id="rId22" w:anchor="java-date-time-api" w:history="1">
+      <w:hyperlink r:id="rId23" w:anchor="java-date-time-api" w:history="1">
         <w:r>
           <w:t>Java Date Time API</w:t>
         </w:r>
@@ -9450,7 +9465,7 @@
           <w:numId w:val="37"/>
         </w:numPr>
       </w:pPr>
-      <w:hyperlink r:id="rId23" w:anchor="collection-api-improvements" w:history="1">
+      <w:hyperlink r:id="rId24" w:anchor="collection-api-improvements" w:history="1">
         <w:r>
           <w:t>Collection API Improvements</w:t>
         </w:r>
@@ -9464,7 +9479,7 @@
           <w:numId w:val="37"/>
         </w:numPr>
       </w:pPr>
-      <w:hyperlink r:id="rId24" w:anchor="java-io-improvements" w:history="1">
+      <w:hyperlink r:id="rId25" w:anchor="java-io-improvements" w:history="1">
         <w:r>
           <w:t>Java IO Improvements</w:t>
         </w:r>
@@ -9478,7 +9493,7 @@
           <w:numId w:val="37"/>
         </w:numPr>
       </w:pPr>
-      <w:hyperlink r:id="rId25" w:anchor="miscellaneous-core-api-improvements" w:history="1">
+      <w:hyperlink r:id="rId26" w:anchor="miscellaneous-core-api-improvements" w:history="1">
         <w:r>
           <w:t>Miscellaneous Core API Improvements</w:t>
         </w:r>
@@ -9492,7 +9507,7 @@
           <w:numId w:val="37"/>
         </w:numPr>
       </w:pPr>
-      <w:hyperlink r:id="rId26" w:anchor="base64-encode-decode-" w:history="1">
+      <w:hyperlink r:id="rId27" w:anchor="base64-encode-decode-" w:history="1">
         <w:r>
           <w:t>Base64 Encode Decode </w:t>
         </w:r>
@@ -9505,7 +9520,7 @@
       <w:r>
         <w:t xml:space="preserve">Resources: </w:t>
       </w:r>
-      <w:hyperlink r:id="rId27" w:history="1">
+      <w:hyperlink r:id="rId28" w:history="1">
         <w:r>
           <w:rPr>
             <w:rStyle w:val="Hyperlink"/>
@@ -9523,7 +9538,7 @@
           <w:numId w:val="12"/>
         </w:numPr>
       </w:pPr>
-      <w:bookmarkStart w:id="26" w:name="_Toc207392428"/>
+      <w:bookmarkStart w:id="26" w:name="_Toc211158595"/>
       <w:r>
         <w:t>What is feature of Java 11?</w:t>
       </w:r>
@@ -9614,7 +9629,7 @@
       <w:r>
         <w:t xml:space="preserve">Resources: </w:t>
       </w:r>
-      <w:hyperlink r:id="rId28" w:history="1">
+      <w:hyperlink r:id="rId29" w:history="1">
         <w:r>
           <w:rPr>
             <w:rStyle w:val="Hyperlink"/>
@@ -9639,7 +9654,7 @@
           <w:numId w:val="12"/>
         </w:numPr>
       </w:pPr>
-      <w:bookmarkStart w:id="27" w:name="_Toc207392429"/>
+      <w:bookmarkStart w:id="27" w:name="_Toc211158596"/>
       <w:r>
         <w:t>What is feature of Java 17?</w:t>
       </w:r>
@@ -9774,7 +9789,7 @@
       <w:r>
         <w:t xml:space="preserve">Resources: </w:t>
       </w:r>
-      <w:hyperlink r:id="rId29" w:history="1">
+      <w:hyperlink r:id="rId30" w:history="1">
         <w:r>
           <w:rPr>
             <w:rStyle w:val="Hyperlink"/>
@@ -9792,7 +9807,7 @@
           <w:numId w:val="12"/>
         </w:numPr>
       </w:pPr>
-      <w:bookmarkStart w:id="28" w:name="_Toc207392430"/>
+      <w:bookmarkStart w:id="28" w:name="_Toc211158597"/>
       <w:r>
         <w:t>What is feature of Java 21?</w:t>
       </w:r>
@@ -9805,7 +9820,7 @@
       <w:r>
         <w:t xml:space="preserve">Resources: </w:t>
       </w:r>
-      <w:hyperlink r:id="rId30" w:anchor=":~:text=Java%2021%20introduced%20three%20new,them%20have%20successors%20and%20predecessors." w:history="1">
+      <w:hyperlink r:id="rId31" w:anchor=":~:text=Java%2021%20introduced%20three%20new,them%20have%20successors%20and%20predecessors." w:history="1">
         <w:r>
           <w:rPr>
             <w:rStyle w:val="Hyperlink"/>
@@ -9823,7 +9838,7 @@
           <w:numId w:val="12"/>
         </w:numPr>
       </w:pPr>
-      <w:bookmarkStart w:id="29" w:name="_Toc207392431"/>
+      <w:bookmarkStart w:id="29" w:name="_Toc211158598"/>
       <w:r>
         <w:t>What is lambda expression</w:t>
       </w:r>
@@ -9866,7 +9881,7 @@
           <w:numId w:val="12"/>
         </w:numPr>
       </w:pPr>
-      <w:bookmarkStart w:id="30" w:name="_Toc207392432"/>
+      <w:bookmarkStart w:id="30" w:name="_Toc211158599"/>
       <w:r>
         <w:t>What is method reference in java?</w:t>
       </w:r>
@@ -9988,7 +10003,7 @@
           <w:numId w:val="12"/>
         </w:numPr>
       </w:pPr>
-      <w:bookmarkStart w:id="31" w:name="_Toc207392433"/>
+      <w:bookmarkStart w:id="31" w:name="_Toc211158600"/>
       <w:r>
         <w:t>can static method override and why not?</w:t>
       </w:r>
@@ -10014,7 +10029,7 @@
           <w:numId w:val="12"/>
         </w:numPr>
       </w:pPr>
-      <w:bookmarkStart w:id="32" w:name="_Toc207392434"/>
+      <w:bookmarkStart w:id="32" w:name="_Toc211158601"/>
       <w:r>
         <w:t>How to make the object/</w:t>
       </w:r>
@@ -10118,7 +10133,7 @@
       <w:r>
         <w:t>:</w:t>
       </w:r>
-      <w:hyperlink r:id="rId31" w:history="1">
+      <w:hyperlink r:id="rId32" w:history="1">
         <w:r>
           <w:rPr>
             <w:rStyle w:val="Hyperlink"/>
@@ -10136,7 +10151,7 @@
           <w:numId w:val="12"/>
         </w:numPr>
       </w:pPr>
-      <w:bookmarkStart w:id="33" w:name="_Toc207392435"/>
+      <w:bookmarkStart w:id="33" w:name="_Toc211158602"/>
       <w:r>
         <w:t xml:space="preserve">What is diamond pattern in java </w:t>
       </w:r>
@@ -10163,7 +10178,7 @@
       <w:r>
         <w:t xml:space="preserve">Resources: </w:t>
       </w:r>
-      <w:hyperlink r:id="rId32" w:history="1">
+      <w:hyperlink r:id="rId33" w:history="1">
         <w:r>
           <w:rPr>
             <w:rStyle w:val="Hyperlink"/>
@@ -10181,7 +10196,7 @@
           <w:numId w:val="12"/>
         </w:numPr>
       </w:pPr>
-      <w:bookmarkStart w:id="34" w:name="_Toc207392436"/>
+      <w:bookmarkStart w:id="34" w:name="_Toc211158603"/>
       <w:r>
         <w:t>What is 100% abstraction in java how to achieve it?</w:t>
       </w:r>
@@ -10260,7 +10275,7 @@
           <w:numId w:val="12"/>
         </w:numPr>
       </w:pPr>
-      <w:bookmarkStart w:id="35" w:name="_Toc207392437"/>
+      <w:bookmarkStart w:id="35" w:name="_Toc211158604"/>
       <w:r>
         <w:t>Diff between the callable and runnable in java?</w:t>
       </w:r>
@@ -10336,7 +10351,7 @@
               </w:rPr>
               <w:t>It is a part of </w:t>
             </w:r>
-            <w:hyperlink r:id="rId33" w:history="1">
+            <w:hyperlink r:id="rId34" w:history="1">
               <w:r>
                 <w:rPr>
                   <w:rStyle w:val="Hyperlink"/>
@@ -10370,7 +10385,7 @@
             <w:r>
               <w:t>It is a part of the </w:t>
             </w:r>
-            <w:hyperlink r:id="rId34" w:history="1">
+            <w:hyperlink r:id="rId35" w:history="1">
               <w:r>
                 <w:rPr>
                   <w:rStyle w:val="Hyperlink"/>
@@ -10526,7 +10541,7 @@
       <w:r>
         <w:t xml:space="preserve">Resources: </w:t>
       </w:r>
-      <w:hyperlink r:id="rId35" w:history="1">
+      <w:hyperlink r:id="rId36" w:history="1">
         <w:r>
           <w:rPr>
             <w:rStyle w:val="Hyperlink"/>
@@ -10548,7 +10563,7 @@
           <w:numId w:val="12"/>
         </w:numPr>
       </w:pPr>
-      <w:bookmarkStart w:id="36" w:name="_Toc207392438"/>
+      <w:bookmarkStart w:id="36" w:name="_Toc211158605"/>
       <w:r>
         <w:t>Different rules of method overriding?</w:t>
       </w:r>
@@ -10561,7 +10576,7 @@
       <w:r>
         <w:t>Resource:</w:t>
       </w:r>
-      <w:hyperlink r:id="rId36" w:history="1">
+      <w:hyperlink r:id="rId37" w:history="1">
         <w:r>
           <w:rPr>
             <w:rStyle w:val="Hyperlink"/>
@@ -10582,7 +10597,7 @@
           <w:numId w:val="12"/>
         </w:numPr>
       </w:pPr>
-      <w:bookmarkStart w:id="37" w:name="_Toc207392439"/>
+      <w:bookmarkStart w:id="37" w:name="_Toc211158606"/>
       <w:r>
         <w:t>Composition vs. Inheritance: A Detailed Comparison</w:t>
       </w:r>
@@ -10598,7 +10613,7 @@
       <w:r>
         <w:t xml:space="preserve">Resource: </w:t>
       </w:r>
-      <w:hyperlink r:id="rId37" w:history="1">
+      <w:hyperlink r:id="rId38" w:history="1">
         <w:r>
           <w:rPr>
             <w:rStyle w:val="Hyperlink"/>
@@ -10616,7 +10631,7 @@
           <w:numId w:val="12"/>
         </w:numPr>
       </w:pPr>
-      <w:bookmarkStart w:id="38" w:name="_Toc207392440"/>
+      <w:bookmarkStart w:id="38" w:name="_Toc211158607"/>
       <w:r>
         <w:t xml:space="preserve">Explain String </w:t>
       </w:r>
@@ -10639,7 +10654,7 @@
       <w:r>
         <w:t xml:space="preserve">Resources: </w:t>
       </w:r>
-      <w:hyperlink r:id="rId38" w:history="1">
+      <w:hyperlink r:id="rId39" w:history="1">
         <w:r>
           <w:rPr>
             <w:rStyle w:val="Hyperlink"/>
@@ -10661,7 +10676,7 @@
           <w:numId w:val="12"/>
         </w:numPr>
       </w:pPr>
-      <w:bookmarkStart w:id="39" w:name="_Toc207392441"/>
+      <w:bookmarkStart w:id="39" w:name="_Toc211158608"/>
       <w:r>
         <w:t>Explain the serialization in java in detail</w:t>
       </w:r>
@@ -10674,7 +10689,7 @@
       <w:r>
         <w:t xml:space="preserve">Resources: </w:t>
       </w:r>
-      <w:hyperlink r:id="rId39" w:history="1">
+      <w:hyperlink r:id="rId40" w:history="1">
         <w:r>
           <w:rPr>
             <w:rStyle w:val="Hyperlink"/>
@@ -10696,7 +10711,7 @@
           <w:numId w:val="12"/>
         </w:numPr>
       </w:pPr>
-      <w:bookmarkStart w:id="40" w:name="_Toc207392442"/>
+      <w:bookmarkStart w:id="40" w:name="_Toc211158609"/>
       <w:r>
         <w:t>Explain the cohesion in java?</w:t>
       </w:r>
@@ -10709,7 +10724,7 @@
       <w:r>
         <w:t xml:space="preserve">Resources: </w:t>
       </w:r>
-      <w:hyperlink r:id="rId40" w:history="1">
+      <w:hyperlink r:id="rId41" w:history="1">
         <w:r>
           <w:rPr>
             <w:rStyle w:val="Hyperlink"/>
@@ -10731,7 +10746,7 @@
           <w:numId w:val="12"/>
         </w:numPr>
       </w:pPr>
-      <w:bookmarkStart w:id="41" w:name="_Toc207392443"/>
+      <w:bookmarkStart w:id="41" w:name="_Toc211158610"/>
       <w:r>
         <w:t>Deep copy vs Shallow in depth and when to use</w:t>
       </w:r>
@@ -10744,7 +10759,7 @@
       <w:r>
         <w:t xml:space="preserve">Resources: </w:t>
       </w:r>
-      <w:hyperlink r:id="rId41" w:history="1">
+      <w:hyperlink r:id="rId42" w:history="1">
         <w:r>
           <w:rPr>
             <w:rStyle w:val="Hyperlink"/>
@@ -10765,7 +10780,7 @@
       <w:r>
         <w:t> </w:t>
       </w:r>
-      <w:bookmarkStart w:id="42" w:name="_Toc207392444"/>
+      <w:bookmarkStart w:id="42" w:name="_Toc211158611"/>
       <w:r>
         <w:t>What are Records in Java, and why are they used?</w:t>
       </w:r>
@@ -10972,7 +10987,7 @@
       <w:r>
         <w:t>(</w:t>
       </w:r>
-      <w:hyperlink r:id="rId42" w:tgtFrame="_self" w:history="1">
+      <w:hyperlink r:id="rId43" w:tgtFrame="_self" w:history="1">
         <w:r>
           <w:rPr>
             <w:rStyle w:val="Hyperlink"/>
@@ -11154,7 +11169,7 @@
       <w:pPr>
         <w:pStyle w:val="Heading2"/>
       </w:pPr>
-      <w:bookmarkStart w:id="43" w:name="_Toc207392445"/>
+      <w:bookmarkStart w:id="43" w:name="_Toc211158612"/>
       <w:r>
         <w:lastRenderedPageBreak/>
         <w:t>Exception Handling</w:t>
@@ -11170,7 +11185,7 @@
           <w:numId w:val="45"/>
         </w:numPr>
       </w:pPr>
-      <w:bookmarkStart w:id="44" w:name="_Toc207392446"/>
+      <w:bookmarkStart w:id="44" w:name="_Toc211158613"/>
       <w:r>
         <w:t>Explain the exception hierarchy</w:t>
       </w:r>
@@ -11203,7 +11218,7 @@
                     </pic:cNvPicPr>
                   </pic:nvPicPr>
                   <pic:blipFill>
-                    <a:blip r:embed="rId43">
+                    <a:blip r:embed="rId44">
                       <a:extLst>
                         <a:ext uri="{28A0092B-C50C-407E-A947-70E740481C1C}">
                           <a14:useLocalDpi xmlns:a14="http://schemas.microsoft.com/office/drawing/2010/main" val="0"/>
@@ -11245,7 +11260,7 @@
           <w:numId w:val="45"/>
         </w:numPr>
       </w:pPr>
-      <w:bookmarkStart w:id="45" w:name="_Toc207392447"/>
+      <w:bookmarkStart w:id="45" w:name="_Toc211158614"/>
       <w:r>
         <w:t>Explain the</w:t>
       </w:r>
@@ -11264,7 +11279,7 @@
       <w:r>
         <w:t xml:space="preserve">Resources: </w:t>
       </w:r>
-      <w:hyperlink r:id="rId44" w:history="1">
+      <w:hyperlink r:id="rId45" w:history="1">
         <w:r>
           <w:rPr>
             <w:rStyle w:val="Hyperlink"/>
@@ -11286,7 +11301,7 @@
           <w:numId w:val="45"/>
         </w:numPr>
       </w:pPr>
-      <w:bookmarkStart w:id="46" w:name="_Toc207392448"/>
+      <w:bookmarkStart w:id="46" w:name="_Toc211158615"/>
       <w:r>
         <w:t xml:space="preserve">Diff between throw and throws </w:t>
       </w:r>
@@ -11307,7 +11322,7 @@
       <w:r>
         <w:t xml:space="preserve">Resources: </w:t>
       </w:r>
-      <w:hyperlink r:id="rId45" w:history="1">
+      <w:hyperlink r:id="rId46" w:history="1">
         <w:r>
           <w:rPr>
             <w:rStyle w:val="Hyperlink"/>
@@ -11335,7 +11350,7 @@
           <w:numId w:val="45"/>
         </w:numPr>
       </w:pPr>
-      <w:bookmarkStart w:id="47" w:name="_Toc207392449"/>
+      <w:bookmarkStart w:id="47" w:name="_Toc211158616"/>
       <w:r>
         <w:t>Tell me the output of below program?</w:t>
       </w:r>
@@ -11601,7 +11616,7 @@
       <w:pPr>
         <w:pStyle w:val="Heading2"/>
       </w:pPr>
-      <w:bookmarkStart w:id="48" w:name="_Toc207392450"/>
+      <w:bookmarkStart w:id="48" w:name="_Toc211158617"/>
       <w:r>
         <w:lastRenderedPageBreak/>
         <w:t>Code Section</w:t>
@@ -11617,7 +11632,7 @@
           <w:numId w:val="44"/>
         </w:numPr>
       </w:pPr>
-      <w:bookmarkStart w:id="49" w:name="_Toc207392451"/>
+      <w:bookmarkStart w:id="49" w:name="_Toc211158618"/>
       <w:r>
         <w:t>Reverse the string</w:t>
       </w:r>
@@ -11828,7 +11843,7 @@
           <w:numId w:val="44"/>
         </w:numPr>
       </w:pPr>
-      <w:bookmarkStart w:id="50" w:name="_Toc207392452"/>
+      <w:bookmarkStart w:id="50" w:name="_Toc211158619"/>
       <w:r>
         <w:t xml:space="preserve">Calculate the occurrence of each character using the stream </w:t>
       </w:r>
@@ -12007,8 +12022,8 @@
           <w:numId w:val="44"/>
         </w:numPr>
       </w:pPr>
-      <w:hyperlink r:id="rId46" w:history="1">
-        <w:bookmarkStart w:id="51" w:name="_Toc207392453"/>
+      <w:hyperlink r:id="rId47" w:history="1">
+        <w:bookmarkStart w:id="51" w:name="_Toc211158620"/>
         <w:r>
           <w:t>Longest Substring Without Repeating Characters</w:t>
         </w:r>
@@ -12251,7 +12266,7 @@
           <w:numId w:val="44"/>
         </w:numPr>
       </w:pPr>
-      <w:bookmarkStart w:id="52" w:name="_Toc207392454"/>
+      <w:bookmarkStart w:id="52" w:name="_Toc211158621"/>
       <w:r>
         <w:t>How do you find the first non-repeating element</w:t>
       </w:r>
@@ -12554,19 +12569,13 @@
           <w:numId w:val="44"/>
         </w:numPr>
       </w:pPr>
-      <w:hyperlink r:id="rId47" w:history="1">
+      <w:hyperlink r:id="rId48" w:history="1">
         <w:r>
           <w:t> </w:t>
         </w:r>
-        <w:bookmarkStart w:id="53" w:name="_Toc207392455"/>
+        <w:bookmarkStart w:id="53" w:name="_Toc211158622"/>
         <w:r>
-          <w:t>Two S</w:t>
-        </w:r>
-        <w:r>
-          <w:t>u</w:t>
-        </w:r>
-        <w:r>
-          <w:t>m</w:t>
+          <w:t>Two Sum</w:t>
         </w:r>
         <w:bookmarkEnd w:id="53"/>
       </w:hyperlink>
@@ -12840,7 +12849,7 @@
           <w:numId w:val="44"/>
         </w:numPr>
       </w:pPr>
-      <w:bookmarkStart w:id="54" w:name="_Toc207392456"/>
+      <w:bookmarkStart w:id="54" w:name="_Toc211158623"/>
       <w:r>
         <w:t xml:space="preserve">Sort the </w:t>
       </w:r>
@@ -17654,6 +17663,7 @@
   <w:style w:type="character" w:default="1" w:styleId="DefaultParagraphFont">
     <w:name w:val="Default Paragraph Font"/>
     <w:uiPriority w:val="1"/>
+    <w:semiHidden/>
     <w:unhideWhenUsed/>
   </w:style>
   <w:style w:type="table" w:default="1" w:styleId="TableNormal">

</xml_diff>